<commit_message>
Knowledge - 8/29/2026 part 2
</commit_message>
<xml_diff>
--- a/Knowledge/1-Academic/1-school/5-Third Primary/2-Second Term/Sources - Third Primary - Second Term.docx
+++ b/Knowledge/1-Academic/1-school/5-Third Primary/2-Second Term/Sources - Third Primary - Second Term.docx
@@ -2722,14 +2722,6 @@
           <w:sz w:val="18"/>
           <w:szCs w:val="18"/>
         </w:rPr>
-        <w:tab/>
-      </w:r>
-      <w:r>
-        <w:rPr>
-          <w:bCs/>
-          <w:sz w:val="18"/>
-          <w:szCs w:val="18"/>
-        </w:rPr>
         <w:t xml:space="preserve">-&gt; </w:t>
       </w:r>
       <w:r>
@@ -2798,6 +2790,14 @@
           <w:szCs w:val="18"/>
         </w:rPr>
         <w:t>Ektsad Manzly</w:t>
+      </w:r>
+      <w:r>
+        <w:rPr>
+          <w:bCs/>
+          <w:sz w:val="18"/>
+          <w:szCs w:val="18"/>
+        </w:rPr>
+        <w:t xml:space="preserve"> </w:t>
       </w:r>
       <w:r>
         <w:rPr>

</xml_diff>